<commit_message>
Docs: test evidence, open items with owners, traceability evidence
</commit_message>
<xml_diff>
--- a/docs/SRS_Team1_SAMS.docx
+++ b/docs/SRS_Team1_SAMS.docx
@@ -6696,7 +6696,7 @@
                 <w:b w:val="0"/>
                 <w:sz w:val="17"/>
               </w:rPr>
-              <w:t>AcademicsConstraintTests</w:t>
+              <w:t>AcademicsConstraintTests (manual: add via admin)</w:t>
             </w:r>
           </w:p>
         </w:tc>
@@ -7494,7 +7494,7 @@
                 <w:b w:val="0"/>
                 <w:sz w:val="17"/>
               </w:rPr>
-              <w:t>-</w:t>
+              <w:t>ApproveLeaveTests (% shown on My attendance)</w:t>
             </w:r>
           </w:p>
         </w:tc>

</xml_diff>